<commit_message>
FCT Zombie Create ajout de message de confirmation
Ajout d’un message de confirmation lors de la création d’un Zombie.
</commit_message>
<xml_diff>
--- a/S02_Lab1_ViewModels_Instructions.docx
+++ b/S02_Lab1_ViewModels_Instructions.docx
@@ -3038,27 +3038,7 @@
           <w:sz w:val="19"/>
           <w:szCs w:val="19"/>
         </w:rPr>
-        <w:t>"</w:t>
-      </w:r>
-      <w:proofErr w:type="spellStart"/>
-      <w:r>
-        <w:rPr>
-          <w:rFonts w:ascii="Cascadia Mono" w:hAnsi="Cascadia Mono" w:cs="Cascadia Mono"/>
-          <w:color w:val="A31515"/>
-          <w:sz w:val="19"/>
-          <w:szCs w:val="19"/>
-        </w:rPr>
-        <w:t>Draugr</w:t>
-      </w:r>
-      <w:proofErr w:type="spellEnd"/>
-      <w:r>
-        <w:rPr>
-          <w:rFonts w:ascii="Cascadia Mono" w:hAnsi="Cascadia Mono" w:cs="Cascadia Mono"/>
-          <w:color w:val="A31515"/>
-          <w:sz w:val="19"/>
-          <w:szCs w:val="19"/>
-        </w:rPr>
-        <w:t>"</w:t>
+        <w:t>"Draugr"</w:t>
       </w:r>
       <w:r>
         <w:rPr>
@@ -8701,7 +8681,7 @@
       <w:hyperlink r:id="rId13" w:history="1">
         <w:r>
           <w:rPr>
-            <w:rStyle w:val="Lienhypertexte"/>
+            <w:rStyle w:val="Hyperlien"/>
           </w:rPr>
           <w:t>https://localhost:NNNN/zombie/create</w:t>
         </w:r>
@@ -10454,7 +10434,15 @@
         <w:t>Ajoutez</w:t>
       </w:r>
       <w:r>
-        <w:t xml:space="preserve"> la View </w:t>
+        <w:t xml:space="preserve"> la </w:t>
+      </w:r>
+      <w:proofErr w:type="spellStart"/>
+      <w:r>
+        <w:t>View</w:t>
+      </w:r>
+      <w:proofErr w:type="spellEnd"/>
+      <w:r>
+        <w:t xml:space="preserve"> </w:t>
       </w:r>
       <w:proofErr w:type="spellStart"/>
       <w:r>
@@ -15402,7 +15390,23 @@
           <w:b/>
           <w:bCs/>
         </w:rPr>
-        <w:t xml:space="preserve"> View Zombie-Index </w:t>
+        <w:t xml:space="preserve"> </w:t>
+      </w:r>
+      <w:proofErr w:type="spellStart"/>
+      <w:r>
+        <w:rPr>
+          <w:b/>
+          <w:bCs/>
+        </w:rPr>
+        <w:t>View</w:t>
+      </w:r>
+      <w:proofErr w:type="spellEnd"/>
+      <w:r>
+        <w:rPr>
+          <w:b/>
+          <w:bCs/>
+        </w:rPr>
+        <w:t xml:space="preserve"> Zombie-Index </w:t>
       </w:r>
     </w:p>
     <w:p>
@@ -17522,8 +17526,10 @@
         <w:t xml:space="preserve">Le chargement des messages d’erreur est-il rapide? </w:t>
       </w:r>
       <w:r>
-        <w:tab/>
-        <w:t xml:space="preserve"> </w:t>
+        <w:rPr>
+          <w:color w:val="EE0000"/>
+        </w:rPr>
+        <w:t>Oui</w:t>
       </w:r>
     </w:p>
     <w:p>
@@ -17869,12 +17875,18 @@
         <w:tabs>
           <w:tab w:val="left" w:leader="underscore" w:pos="7371"/>
         </w:tabs>
+        <w:rPr>
+          <w:color w:val="EE0000"/>
+        </w:rPr>
       </w:pPr>
       <w:r>
         <w:t xml:space="preserve">Pourquoi? </w:t>
       </w:r>
       <w:r>
-        <w:tab/>
+        <w:rPr>
+          <w:color w:val="EE0000"/>
+        </w:rPr>
+        <w:t>Car la validation du navigateur n’existe plus, on se fie à la validation au niveau du serveur.</w:t>
       </w:r>
     </w:p>
     <w:p>
@@ -17951,7 +17963,10 @@
         <w:t xml:space="preserve"> (oui/non)? </w:t>
       </w:r>
       <w:r>
-        <w:tab/>
+        <w:rPr>
+          <w:color w:val="EE0000"/>
+        </w:rPr>
+        <w:t>Oui</w:t>
       </w:r>
     </w:p>
     <w:p>
@@ -18014,7 +18029,10 @@
         <w:t xml:space="preserve">Les données restent-elles affichées (oui/non)? </w:t>
       </w:r>
       <w:r>
-        <w:tab/>
+        <w:rPr>
+          <w:color w:val="EE0000"/>
+        </w:rPr>
+        <w:t>Non</w:t>
       </w:r>
       <w:r>
         <w:t xml:space="preserve">, la liste des </w:t>
@@ -18029,6 +18047,29 @@
       </w:r>
       <w:r>
         <w:t xml:space="preserve"> Pourquoi?</w:t>
+      </w:r>
+      <w:r>
+        <w:t xml:space="preserve"> </w:t>
+      </w:r>
+      <w:r>
+        <w:rPr>
+          <w:color w:val="EE0000"/>
+        </w:rPr>
+        <w:t xml:space="preserve">Car le </w:t>
+      </w:r>
+      <w:proofErr w:type="spellStart"/>
+      <w:r>
+        <w:rPr>
+          <w:color w:val="EE0000"/>
+        </w:rPr>
+        <w:t>ViewBag</w:t>
+      </w:r>
+      <w:proofErr w:type="spellEnd"/>
+      <w:r>
+        <w:rPr>
+          <w:color w:val="EE0000"/>
+        </w:rPr>
+        <w:t xml:space="preserve"> est vide jusqu’à temps que cette ligne lui affecte la liste des zombies de notre base de données.</w:t>
       </w:r>
     </w:p>
     <w:p>
@@ -18097,6 +18138,15 @@
       </w:r>
       <w:r>
         <w:t>ccès de l’enregistrement mais on ne voit jamais ce message. Pourquoi?</w:t>
+      </w:r>
+      <w:r>
+        <w:t xml:space="preserve"> </w:t>
+      </w:r>
+      <w:r>
+        <w:rPr>
+          <w:color w:val="EE0000"/>
+        </w:rPr>
+        <w:t>Car on ne l’appelle jamais pour être affiché dans la vue.</w:t>
       </w:r>
     </w:p>
     <w:p>
@@ -18994,7 +19044,24 @@
         <w:t>Es</w:t>
       </w:r>
       <w:r>
-        <w:t>t-ce que ModelState est valide?</w:t>
+        <w:t xml:space="preserve">t-ce que </w:t>
+      </w:r>
+      <w:proofErr w:type="spellStart"/>
+      <w:r>
+        <w:t>ModelState</w:t>
+      </w:r>
+      <w:proofErr w:type="spellEnd"/>
+      <w:r>
+        <w:t xml:space="preserve"> est valide?</w:t>
+      </w:r>
+      <w:r>
+        <w:t xml:space="preserve"> </w:t>
+      </w:r>
+      <w:r>
+        <w:rPr>
+          <w:color w:val="EE0000"/>
+        </w:rPr>
+        <w:t>Oui</w:t>
       </w:r>
     </w:p>
     <w:p>
@@ -19008,6 +19075,15 @@
       <w:r>
         <w:t>Où sont les informations saisies?</w:t>
       </w:r>
+      <w:r>
+        <w:t xml:space="preserve"> Ils sont envoy</w:t>
+      </w:r>
+      <w:r>
+        <w:t>és vers l</w:t>
+      </w:r>
+      <w:r>
+        <w:t>a base de données.</w:t>
+      </w:r>
     </w:p>
     <w:p>
       <w:pPr>
@@ -19019,6 +19095,9 @@
       </w:pPr>
       <w:r>
         <w:t>Le message de confirmation s’affiche-t-il?</w:t>
+      </w:r>
+      <w:r>
+        <w:t xml:space="preserve"> Oui</w:t>
       </w:r>
     </w:p>
     <w:p>
@@ -25699,7 +25778,15 @@
         <w:ind w:left="360"/>
       </w:pPr>
       <w:r>
-        <w:t xml:space="preserve">La View présente un </w:t>
+        <w:t xml:space="preserve">La </w:t>
+      </w:r>
+      <w:proofErr w:type="spellStart"/>
+      <w:r>
+        <w:t>View</w:t>
+      </w:r>
+      <w:proofErr w:type="spellEnd"/>
+      <w:r>
+        <w:t xml:space="preserve"> présente un </w:t>
       </w:r>
       <w:proofErr w:type="spellStart"/>
       <w:r>
@@ -26500,7 +26587,27 @@
           <w:sz w:val="19"/>
           <w:szCs w:val="19"/>
         </w:rPr>
-        <w:t xml:space="preserve"> View(</w:t>
+        <w:t xml:space="preserve"> </w:t>
+      </w:r>
+      <w:proofErr w:type="spellStart"/>
+      <w:r>
+        <w:rPr>
+          <w:rFonts w:ascii="Cascadia Mono" w:hAnsi="Cascadia Mono" w:cs="Cascadia Mono"/>
+          <w:color w:val="000000"/>
+          <w:sz w:val="19"/>
+          <w:szCs w:val="19"/>
+        </w:rPr>
+        <w:t>View</w:t>
+      </w:r>
+      <w:proofErr w:type="spellEnd"/>
+      <w:r>
+        <w:rPr>
+          <w:rFonts w:ascii="Cascadia Mono" w:hAnsi="Cascadia Mono" w:cs="Cascadia Mono"/>
+          <w:color w:val="000000"/>
+          <w:sz w:val="19"/>
+          <w:szCs w:val="19"/>
+        </w:rPr>
+        <w:t>(</w:t>
       </w:r>
       <w:proofErr w:type="spellStart"/>
       <w:r>
@@ -26880,7 +26987,15 @@
       </w:r>
       <w:proofErr w:type="spellEnd"/>
       <w:r>
-        <w:t>, dans chaque View?</w:t>
+        <w:t xml:space="preserve">, dans chaque </w:t>
+      </w:r>
+      <w:proofErr w:type="spellStart"/>
+      <w:r>
+        <w:t>View</w:t>
+      </w:r>
+      <w:proofErr w:type="spellEnd"/>
+      <w:r>
+        <w:t>?</w:t>
       </w:r>
     </w:p>
     <w:p>
@@ -31661,8 +31776,13 @@
       <w:r>
         <w:t xml:space="preserve">: FCT </w:t>
       </w:r>
-      <w:r>
-        <w:t xml:space="preserve">View Details </w:t>
+      <w:proofErr w:type="spellStart"/>
+      <w:r>
+        <w:t>View</w:t>
+      </w:r>
+      <w:proofErr w:type="spellEnd"/>
+      <w:r>
+        <w:t xml:space="preserve"> Details </w:t>
       </w:r>
       <w:proofErr w:type="spellStart"/>
       <w:r>
@@ -32053,17 +32173,8 @@
           <w:b/>
           <w:bCs/>
         </w:rPr>
-        <w:t xml:space="preserve">Manage </w:t>
-      </w:r>
-      <w:proofErr w:type="spellStart"/>
-      <w:r>
-        <w:rPr>
-          <w:b/>
-          <w:bCs/>
-        </w:rPr>
-        <w:t>Weapons</w:t>
-      </w:r>
-      <w:proofErr w:type="spellEnd"/>
+        <w:t>Manage Weapons</w:t>
+      </w:r>
     </w:p>
     <w:p>
       <w:pPr>
@@ -33128,7 +33239,6 @@
       <w:r>
         <w:t xml:space="preserve">Ajoutez la classe </w:t>
       </w:r>
-      <w:proofErr w:type="spellStart"/>
       <w:r>
         <w:rPr>
           <w:b/>
@@ -33136,7 +33246,6 @@
         </w:rPr>
         <w:t>Weapon</w:t>
       </w:r>
-      <w:proofErr w:type="spellEnd"/>
       <w:r>
         <w:t xml:space="preserve"> ci-dessous</w:t>
       </w:r>
@@ -34281,15 +34390,7 @@
         <w:t>propriétés de l</w:t>
       </w:r>
       <w:r>
-        <w:t xml:space="preserve">a classe </w:t>
-      </w:r>
-      <w:proofErr w:type="spellStart"/>
-      <w:r>
-        <w:t>Weapon</w:t>
-      </w:r>
-      <w:proofErr w:type="spellEnd"/>
-      <w:r>
-        <w:t xml:space="preserve">: </w:t>
+        <w:t xml:space="preserve">a classe Weapon: </w:t>
       </w:r>
     </w:p>
     <w:p>
@@ -34707,15 +34808,7 @@
         </w:numPr>
       </w:pPr>
       <w:r>
-        <w:t xml:space="preserve">Ajoutez une validation personnalisée à </w:t>
-      </w:r>
-      <w:proofErr w:type="spellStart"/>
-      <w:r>
-        <w:t>Weapon</w:t>
-      </w:r>
-      <w:proofErr w:type="spellEnd"/>
-      <w:r>
-        <w:t xml:space="preserve"> qui vérifie que la description est de plus de 3 mots (séparé</w:t>
+        <w:t>Ajoutez une validation personnalisée à Weapon qui vérifie que la description est de plus de 3 mots (séparé</w:t>
       </w:r>
       <w:r>
         <w:t>s</w:t>
@@ -35698,85 +35791,61 @@
       </w:r>
       <w:bookmarkStart w:id="1" w:name="_Hlk136365074"/>
       <w:r>
-        <w:t xml:space="preserve">la classe </w:t>
+        <w:t>la classe Weapon, il faut également que</w:t>
+      </w:r>
+      <w:bookmarkEnd w:id="1"/>
+      <w:r>
+        <w:t xml:space="preserve"> cette classe implémente l’interface </w:t>
       </w:r>
       <w:proofErr w:type="spellStart"/>
       <w:r>
-        <w:t>Weapon</w:t>
+        <w:rPr>
+          <w:rFonts w:ascii="Cascadia Mono" w:hAnsi="Cascadia Mono" w:cs="Cascadia Mono"/>
+          <w:color w:val="000000"/>
+          <w:sz w:val="19"/>
+          <w:szCs w:val="19"/>
+        </w:rPr>
+        <w:t>IValidatableObject</w:t>
       </w:r>
       <w:proofErr w:type="spellEnd"/>
       <w:r>
-        <w:t>, il faut également que</w:t>
-      </w:r>
-      <w:bookmarkEnd w:id="1"/>
-      <w:r>
-        <w:t xml:space="preserve"> cette classe implémente l’interface </w:t>
+        <w:rPr>
+          <w:rFonts w:ascii="Cascadia Mono" w:hAnsi="Cascadia Mono" w:cs="Cascadia Mono"/>
+          <w:color w:val="000000"/>
+          <w:sz w:val="19"/>
+          <w:szCs w:val="19"/>
+        </w:rPr>
+        <w:t xml:space="preserve"> </w:t>
+      </w:r>
+      <w:r>
+        <w:rPr>
+          <w:rFonts w:cs="Cascadia Mono"/>
+          <w:color w:val="000000"/>
+        </w:rPr>
+        <w:t xml:space="preserve">pour que </w:t>
+      </w:r>
+      <w:r>
+        <w:rPr>
+          <w:rFonts w:cs="Cascadia Mono"/>
+          <w:color w:val="000000"/>
+        </w:rPr>
+        <w:t xml:space="preserve">le </w:t>
       </w:r>
       <w:proofErr w:type="spellStart"/>
       <w:r>
         <w:rPr>
-          <w:rFonts w:ascii="Cascadia Mono" w:hAnsi="Cascadia Mono" w:cs="Cascadia Mono"/>
-          <w:color w:val="000000"/>
-          <w:sz w:val="19"/>
-          <w:szCs w:val="19"/>
-        </w:rPr>
-        <w:t>IValidatableObject</w:t>
+          <w:rFonts w:cs="Cascadia Mono"/>
+          <w:color w:val="000000"/>
+        </w:rPr>
+        <w:t>framework</w:t>
       </w:r>
       <w:proofErr w:type="spellEnd"/>
       <w:r>
         <w:rPr>
-          <w:rFonts w:ascii="Cascadia Mono" w:hAnsi="Cascadia Mono" w:cs="Cascadia Mono"/>
-          <w:color w:val="000000"/>
-          <w:sz w:val="19"/>
-          <w:szCs w:val="19"/>
-        </w:rPr>
-        <w:t xml:space="preserve"> </w:t>
-      </w:r>
-      <w:r>
-        <w:rPr>
           <w:rFonts w:cs="Cascadia Mono"/>
           <w:color w:val="000000"/>
         </w:rPr>
-        <w:t xml:space="preserve">pour que </w:t>
-      </w:r>
-      <w:r>
-        <w:rPr>
-          <w:rFonts w:cs="Cascadia Mono"/>
-          <w:color w:val="000000"/>
-        </w:rPr>
-        <w:t xml:space="preserve">le </w:t>
-      </w:r>
-      <w:proofErr w:type="spellStart"/>
-      <w:r>
-        <w:rPr>
-          <w:rFonts w:cs="Cascadia Mono"/>
-          <w:color w:val="000000"/>
-        </w:rPr>
-        <w:t>framework</w:t>
-      </w:r>
-      <w:proofErr w:type="spellEnd"/>
-      <w:r>
-        <w:rPr>
-          <w:rFonts w:cs="Cascadia Mono"/>
-          <w:color w:val="000000"/>
-        </w:rPr>
-        <w:t xml:space="preserve"> sache que </w:t>
-      </w:r>
-      <w:proofErr w:type="spellStart"/>
-      <w:r>
-        <w:rPr>
-          <w:rFonts w:cs="Cascadia Mono"/>
-          <w:color w:val="000000"/>
-        </w:rPr>
-        <w:t>Weapon</w:t>
-      </w:r>
-      <w:proofErr w:type="spellEnd"/>
-      <w:r>
-        <w:rPr>
-          <w:rFonts w:cs="Cascadia Mono"/>
-          <w:color w:val="000000"/>
-        </w:rPr>
-        <w:t xml:space="preserve"> doit être validé.</w:t>
+        <w:t xml:space="preserve"> sache que Weapon doit être validé.</w:t>
       </w:r>
     </w:p>
     <w:p>
@@ -35870,15 +35939,7 @@
         <w:t>z</w:t>
       </w:r>
       <w:r>
-        <w:t xml:space="preserve"> le contrôleur pour les </w:t>
-      </w:r>
-      <w:proofErr w:type="spellStart"/>
-      <w:r>
-        <w:t>Weapons</w:t>
-      </w:r>
-      <w:proofErr w:type="spellEnd"/>
-      <w:r>
-        <w:t xml:space="preserve"> avec les actions</w:t>
+        <w:t xml:space="preserve"> le contrôleur pour les Weapons avec les actions</w:t>
       </w:r>
       <w:r>
         <w:t xml:space="preserve"> Index et </w:t>
@@ -36712,15 +36773,7 @@
         <w:t>z</w:t>
       </w:r>
       <w:r>
-        <w:t xml:space="preserve"> les vues générées de liste et de création pour </w:t>
-      </w:r>
-      <w:proofErr w:type="spellStart"/>
-      <w:r>
-        <w:t>Weapon</w:t>
-      </w:r>
-      <w:proofErr w:type="spellEnd"/>
-      <w:r>
-        <w:t xml:space="preserve">. </w:t>
+        <w:t xml:space="preserve"> les vues générées de liste et de création pour Weapon. </w:t>
       </w:r>
     </w:p>
     <w:p>
@@ -36843,16 +36896,11 @@
         </w:numPr>
       </w:pPr>
       <w:r>
-        <w:t xml:space="preserve">Ajoutez 2 </w:t>
-      </w:r>
-      <w:proofErr w:type="spellStart"/>
-      <w:r>
-        <w:t>Weapon</w:t>
+        <w:t>Ajoutez 2 Weapon</w:t>
       </w:r>
       <w:r>
         <w:t>s</w:t>
       </w:r>
-      <w:proofErr w:type="spellEnd"/>
       <w:r>
         <w:t xml:space="preserve"> de base dans l’entrepôt de données.</w:t>
       </w:r>
@@ -38767,7 +38815,6 @@
       <w:r>
         <w:t xml:space="preserve">afficher les </w:t>
       </w:r>
-      <w:proofErr w:type="spellStart"/>
       <w:r>
         <w:rPr>
           <w:b/>
@@ -38782,7 +38829,6 @@
         </w:rPr>
         <w:t>s</w:t>
       </w:r>
-      <w:proofErr w:type="spellEnd"/>
       <w:r>
         <w:t xml:space="preserve"> et </w:t>
       </w:r>
@@ -38941,15 +38987,7 @@
         <w:t xml:space="preserve">: </w:t>
       </w:r>
       <w:r>
-        <w:t xml:space="preserve">Maintenant possible de voir la liste de </w:t>
-      </w:r>
-      <w:proofErr w:type="spellStart"/>
-      <w:r>
-        <w:t>Weapons</w:t>
-      </w:r>
-      <w:proofErr w:type="spellEnd"/>
-      <w:r>
-        <w:t xml:space="preserve"> et d’en a</w:t>
+        <w:t>Maintenant possible de voir la liste de Weapons et d’en a</w:t>
       </w:r>
       <w:r>
         <w:t>jout</w:t>
@@ -44366,7 +44404,7 @@
       <w:szCs w:val="21"/>
     </w:rPr>
   </w:style>
-  <w:style w:type="character" w:styleId="Lienhypertexte">
+  <w:style w:type="character" w:styleId="Hyperlien">
     <w:name w:val="Hyperlink"/>
     <w:basedOn w:val="Policepardfaut"/>
     <w:uiPriority w:val="99"/>
@@ -44486,7 +44524,7 @@
       </w:tblBorders>
     </w:tblPr>
   </w:style>
-  <w:style w:type="character" w:styleId="Lienhypertextesuivivisit">
+  <w:style w:type="character" w:styleId="Lienvisit">
     <w:name w:val="FollowedHyperlink"/>
     <w:basedOn w:val="Policepardfaut"/>
     <w:uiPriority w:val="99"/>
@@ -44812,15 +44850,6 @@
 </file>
 
 <file path=customXml/item1.xml><?xml version="1.0" encoding="utf-8"?>
-<?mso-contentType ?>
-<FormTemplates xmlns="http://schemas.microsoft.com/sharepoint/v3/contenttype/forms">
-  <Display>DocumentLibraryForm</Display>
-  <Edit>DocumentLibraryForm</Edit>
-  <New>DocumentLibraryForm</New>
-</FormTemplates>
-</file>
-
-<file path=customXml/item2.xml><?xml version="1.0" encoding="utf-8"?>
 <ct:contentTypeSchema xmlns:ct="http://schemas.microsoft.com/office/2006/metadata/contentType" xmlns:ma="http://schemas.microsoft.com/office/2006/metadata/properties/metaAttributes" ct:_="" ma:_="" ma:contentTypeName="Document" ma:contentTypeID="0x010100354AEAE9FD62D747A26A546E5B1B5735" ma:contentTypeVersion="7" ma:contentTypeDescription="Crée un document." ma:contentTypeScope="" ma:versionID="43b763fe9aa20b7a2976a5e019d82dbf">
   <xsd:schema xmlns:xsd="http://www.w3.org/2001/XMLSchema" xmlns:xs="http://www.w3.org/2001/XMLSchema" xmlns:p="http://schemas.microsoft.com/office/2006/metadata/properties" xmlns:ns2="071933db-0376-4694-9786-b56cb37c4ec2" targetNamespace="http://schemas.microsoft.com/office/2006/metadata/properties" ma:root="true" ma:fieldsID="d5c90ae6c1ec6ed317c9f5feddaf7a33" ns2:_="">
     <xsd:import namespace="071933db-0376-4694-9786-b56cb37c4ec2"/>
@@ -44984,25 +45013,26 @@
 </ct:contentTypeSchema>
 </file>
 
-<file path=customXml/item3.xml><?xml version="1.0" encoding="utf-8"?>
-<b:Sources xmlns:b="http://schemas.openxmlformats.org/officeDocument/2006/bibliography" xmlns="http://schemas.openxmlformats.org/officeDocument/2006/bibliography" SelectedStyle="\APASixthEditionOfficeOnline.xsl" StyleName="APA" Version="6"/>
+<file path=customXml/item2.xml><?xml version="1.0" encoding="utf-8"?>
+<?mso-contentType ?>
+<FormTemplates xmlns="http://schemas.microsoft.com/sharepoint/v3/contenttype/forms">
+  <Display>DocumentLibraryForm</Display>
+  <Edit>DocumentLibraryForm</Edit>
+  <New>DocumentLibraryForm</New>
+</FormTemplates>
 </file>
 
-<file path=customXml/item4.xml><?xml version="1.0" encoding="utf-8"?>
+<file path=customXml/item3.xml><?xml version="1.0" encoding="utf-8"?>
 <p:properties xmlns:p="http://schemas.microsoft.com/office/2006/metadata/properties" xmlns:xsi="http://www.w3.org/2001/XMLSchema-instance" xmlns:pc="http://schemas.microsoft.com/office/infopath/2007/PartnerControls">
   <documentManagement/>
 </p:properties>
 </file>
 
-<file path=customXml/itemProps1.xml><?xml version="1.0" encoding="utf-8"?>
-<ds:datastoreItem xmlns:ds="http://schemas.openxmlformats.org/officeDocument/2006/customXml" ds:itemID="{F6194C16-5FE5-4670-BEC8-3D6DD9380312}">
-  <ds:schemaRefs>
-    <ds:schemaRef ds:uri="http://schemas.microsoft.com/sharepoint/v3/contenttype/forms"/>
-  </ds:schemaRefs>
-</ds:datastoreItem>
+<file path=customXml/item4.xml><?xml version="1.0" encoding="utf-8"?>
+<b:Sources xmlns:b="http://schemas.openxmlformats.org/officeDocument/2006/bibliography" xmlns="http://schemas.openxmlformats.org/officeDocument/2006/bibliography" SelectedStyle="\APASixthEditionOfficeOnline.xsl" StyleName="APA" Version="6"/>
 </file>
 
-<file path=customXml/itemProps2.xml><?xml version="1.0" encoding="utf-8"?>
+<file path=customXml/itemProps1.xml><?xml version="1.0" encoding="utf-8"?>
 <ds:datastoreItem xmlns:ds="http://schemas.openxmlformats.org/officeDocument/2006/customXml" ds:itemID="{5C3A06EC-DC03-4D65-AA15-C6B9D68C1ED0}">
   <ds:schemaRefs>
     <ds:schemaRef ds:uri="http://schemas.microsoft.com/office/2006/metadata/contentType"/>
@@ -45020,19 +45050,27 @@
 </ds:datastoreItem>
 </file>
 
-<file path=customXml/itemProps3.xml><?xml version="1.0" encoding="utf-8"?>
-<ds:datastoreItem xmlns:ds="http://schemas.openxmlformats.org/officeDocument/2006/customXml" ds:itemID="{BA5DC8B6-1F73-4844-8DA8-B484D55D7FC3}">
+<file path=customXml/itemProps2.xml><?xml version="1.0" encoding="utf-8"?>
+<ds:datastoreItem xmlns:ds="http://schemas.openxmlformats.org/officeDocument/2006/customXml" ds:itemID="{F6194C16-5FE5-4670-BEC8-3D6DD9380312}">
   <ds:schemaRefs>
-    <ds:schemaRef ds:uri="http://schemas.openxmlformats.org/officeDocument/2006/bibliography"/>
+    <ds:schemaRef ds:uri="http://schemas.microsoft.com/sharepoint/v3/contenttype/forms"/>
   </ds:schemaRefs>
 </ds:datastoreItem>
 </file>
 
-<file path=customXml/itemProps4.xml><?xml version="1.0" encoding="utf-8"?>
+<file path=customXml/itemProps3.xml><?xml version="1.0" encoding="utf-8"?>
 <ds:datastoreItem xmlns:ds="http://schemas.openxmlformats.org/officeDocument/2006/customXml" ds:itemID="{2C36E056-BA2C-4A1F-9580-242C9B36FE70}">
   <ds:schemaRefs>
     <ds:schemaRef ds:uri="http://schemas.microsoft.com/office/2006/metadata/properties"/>
     <ds:schemaRef ds:uri="http://schemas.microsoft.com/office/infopath/2007/PartnerControls"/>
   </ds:schemaRefs>
 </ds:datastoreItem>
+</file>
+
+<file path=customXml/itemProps4.xml><?xml version="1.0" encoding="utf-8"?>
+<ds:datastoreItem xmlns:ds="http://schemas.openxmlformats.org/officeDocument/2006/customXml" ds:itemID="{BA5DC8B6-1F73-4844-8DA8-B484D55D7FC3}">
+  <ds:schemaRefs>
+    <ds:schemaRef ds:uri="http://schemas.openxmlformats.org/officeDocument/2006/bibliography"/>
+  </ds:schemaRefs>
+</ds:datastoreItem>
 </file>
</xml_diff>

<commit_message>
Réponse aux questions de l'énoncé
</commit_message>
<xml_diff>
--- a/S02_Lab1_ViewModels_Instructions.docx
+++ b/S02_Lab1_ViewModels_Instructions.docx
@@ -3038,27 +3038,7 @@
           <w:sz w:val="19"/>
           <w:szCs w:val="19"/>
         </w:rPr>
-        <w:t>"</w:t>
-      </w:r>
-      <w:proofErr w:type="spellStart"/>
-      <w:r>
-        <w:rPr>
-          <w:rFonts w:ascii="Cascadia Mono" w:hAnsi="Cascadia Mono" w:cs="Cascadia Mono"/>
-          <w:color w:val="A31515"/>
-          <w:sz w:val="19"/>
-          <w:szCs w:val="19"/>
-        </w:rPr>
-        <w:t>Draugr</w:t>
-      </w:r>
-      <w:proofErr w:type="spellEnd"/>
-      <w:r>
-        <w:rPr>
-          <w:rFonts w:ascii="Cascadia Mono" w:hAnsi="Cascadia Mono" w:cs="Cascadia Mono"/>
-          <w:color w:val="A31515"/>
-          <w:sz w:val="19"/>
-          <w:szCs w:val="19"/>
-        </w:rPr>
-        <w:t>"</w:t>
+        <w:t>"Draugr"</w:t>
       </w:r>
       <w:r>
         <w:rPr>
@@ -8701,7 +8681,7 @@
       <w:hyperlink r:id="rId13" w:history="1">
         <w:r>
           <w:rPr>
-            <w:rStyle w:val="Lienhypertexte"/>
+            <w:rStyle w:val="Hyperlien"/>
           </w:rPr>
           <w:t>https://localhost:NNNN/zombie/create</w:t>
         </w:r>
@@ -10454,7 +10434,15 @@
         <w:t>Ajoutez</w:t>
       </w:r>
       <w:r>
-        <w:t xml:space="preserve"> la View </w:t>
+        <w:t xml:space="preserve"> la </w:t>
+      </w:r>
+      <w:proofErr w:type="spellStart"/>
+      <w:r>
+        <w:t>View</w:t>
+      </w:r>
+      <w:proofErr w:type="spellEnd"/>
+      <w:r>
+        <w:t xml:space="preserve"> </w:t>
       </w:r>
       <w:proofErr w:type="spellStart"/>
       <w:r>
@@ -15402,7 +15390,23 @@
           <w:b/>
           <w:bCs/>
         </w:rPr>
-        <w:t xml:space="preserve"> View Zombie-Index </w:t>
+        <w:t xml:space="preserve"> </w:t>
+      </w:r>
+      <w:proofErr w:type="spellStart"/>
+      <w:r>
+        <w:rPr>
+          <w:b/>
+          <w:bCs/>
+        </w:rPr>
+        <w:t>View</w:t>
+      </w:r>
+      <w:proofErr w:type="spellEnd"/>
+      <w:r>
+        <w:rPr>
+          <w:b/>
+          <w:bCs/>
+        </w:rPr>
+        <w:t xml:space="preserve"> Zombie-Index </w:t>
       </w:r>
     </w:p>
     <w:p>
@@ -17522,8 +17526,10 @@
         <w:t xml:space="preserve">Le chargement des messages d’erreur est-il rapide? </w:t>
       </w:r>
       <w:r>
-        <w:tab/>
-        <w:t xml:space="preserve"> </w:t>
+        <w:rPr>
+          <w:color w:val="EE0000"/>
+        </w:rPr>
+        <w:t>Oui</w:t>
       </w:r>
     </w:p>
     <w:p>
@@ -17869,12 +17875,18 @@
         <w:tabs>
           <w:tab w:val="left" w:leader="underscore" w:pos="7371"/>
         </w:tabs>
+        <w:rPr>
+          <w:color w:val="EE0000"/>
+        </w:rPr>
       </w:pPr>
       <w:r>
         <w:t xml:space="preserve">Pourquoi? </w:t>
       </w:r>
       <w:r>
-        <w:tab/>
+        <w:rPr>
+          <w:color w:val="EE0000"/>
+        </w:rPr>
+        <w:t>Car la validation du navigateur n’existe plus, on se fie à la validation au niveau du serveur.</w:t>
       </w:r>
     </w:p>
     <w:p>
@@ -17951,7 +17963,10 @@
         <w:t xml:space="preserve"> (oui/non)? </w:t>
       </w:r>
       <w:r>
-        <w:tab/>
+        <w:rPr>
+          <w:color w:val="EE0000"/>
+        </w:rPr>
+        <w:t>Oui</w:t>
       </w:r>
     </w:p>
     <w:p>
@@ -18014,7 +18029,10 @@
         <w:t xml:space="preserve">Les données restent-elles affichées (oui/non)? </w:t>
       </w:r>
       <w:r>
-        <w:tab/>
+        <w:rPr>
+          <w:color w:val="EE0000"/>
+        </w:rPr>
+        <w:t>Non</w:t>
       </w:r>
       <w:r>
         <w:t xml:space="preserve">, la liste des </w:t>
@@ -18029,6 +18047,29 @@
       </w:r>
       <w:r>
         <w:t xml:space="preserve"> Pourquoi?</w:t>
+      </w:r>
+      <w:r>
+        <w:t xml:space="preserve"> </w:t>
+      </w:r>
+      <w:r>
+        <w:rPr>
+          <w:color w:val="EE0000"/>
+        </w:rPr>
+        <w:t xml:space="preserve">Car le </w:t>
+      </w:r>
+      <w:proofErr w:type="spellStart"/>
+      <w:r>
+        <w:rPr>
+          <w:color w:val="EE0000"/>
+        </w:rPr>
+        <w:t>ViewBag</w:t>
+      </w:r>
+      <w:proofErr w:type="spellEnd"/>
+      <w:r>
+        <w:rPr>
+          <w:color w:val="EE0000"/>
+        </w:rPr>
+        <w:t xml:space="preserve"> est vide jusqu’à temps que cette ligne lui affecte la liste des zombies de notre base de données.</w:t>
       </w:r>
     </w:p>
     <w:p>
@@ -18097,6 +18138,15 @@
       </w:r>
       <w:r>
         <w:t>ccès de l’enregistrement mais on ne voit jamais ce message. Pourquoi?</w:t>
+      </w:r>
+      <w:r>
+        <w:t xml:space="preserve"> </w:t>
+      </w:r>
+      <w:r>
+        <w:rPr>
+          <w:color w:val="EE0000"/>
+        </w:rPr>
+        <w:t>Car on ne l’appelle jamais pour être affiché dans la vue.</w:t>
       </w:r>
     </w:p>
     <w:p>
@@ -18994,7 +19044,24 @@
         <w:t>Es</w:t>
       </w:r>
       <w:r>
-        <w:t>t-ce que ModelState est valide?</w:t>
+        <w:t xml:space="preserve">t-ce que </w:t>
+      </w:r>
+      <w:proofErr w:type="spellStart"/>
+      <w:r>
+        <w:t>ModelState</w:t>
+      </w:r>
+      <w:proofErr w:type="spellEnd"/>
+      <w:r>
+        <w:t xml:space="preserve"> est valide?</w:t>
+      </w:r>
+      <w:r>
+        <w:t xml:space="preserve"> </w:t>
+      </w:r>
+      <w:r>
+        <w:rPr>
+          <w:color w:val="EE0000"/>
+        </w:rPr>
+        <w:t>Oui</w:t>
       </w:r>
     </w:p>
     <w:p>
@@ -19008,6 +19075,15 @@
       <w:r>
         <w:t>Où sont les informations saisies?</w:t>
       </w:r>
+      <w:r>
+        <w:t xml:space="preserve"> Ils sont envoy</w:t>
+      </w:r>
+      <w:r>
+        <w:t>és vers l</w:t>
+      </w:r>
+      <w:r>
+        <w:t>a base de données.</w:t>
+      </w:r>
     </w:p>
     <w:p>
       <w:pPr>
@@ -19019,6 +19095,9 @@
       </w:pPr>
       <w:r>
         <w:t>Le message de confirmation s’affiche-t-il?</w:t>
+      </w:r>
+      <w:r>
+        <w:t xml:space="preserve"> Oui</w:t>
       </w:r>
     </w:p>
     <w:p>
@@ -25699,7 +25778,15 @@
         <w:ind w:left="360"/>
       </w:pPr>
       <w:r>
-        <w:t xml:space="preserve">La View présente un </w:t>
+        <w:t xml:space="preserve">La </w:t>
+      </w:r>
+      <w:proofErr w:type="spellStart"/>
+      <w:r>
+        <w:t>View</w:t>
+      </w:r>
+      <w:proofErr w:type="spellEnd"/>
+      <w:r>
+        <w:t xml:space="preserve"> présente un </w:t>
       </w:r>
       <w:proofErr w:type="spellStart"/>
       <w:r>
@@ -26500,7 +26587,27 @@
           <w:sz w:val="19"/>
           <w:szCs w:val="19"/>
         </w:rPr>
-        <w:t xml:space="preserve"> View(</w:t>
+        <w:t xml:space="preserve"> </w:t>
+      </w:r>
+      <w:proofErr w:type="spellStart"/>
+      <w:r>
+        <w:rPr>
+          <w:rFonts w:ascii="Cascadia Mono" w:hAnsi="Cascadia Mono" w:cs="Cascadia Mono"/>
+          <w:color w:val="000000"/>
+          <w:sz w:val="19"/>
+          <w:szCs w:val="19"/>
+        </w:rPr>
+        <w:t>View</w:t>
+      </w:r>
+      <w:proofErr w:type="spellEnd"/>
+      <w:r>
+        <w:rPr>
+          <w:rFonts w:ascii="Cascadia Mono" w:hAnsi="Cascadia Mono" w:cs="Cascadia Mono"/>
+          <w:color w:val="000000"/>
+          <w:sz w:val="19"/>
+          <w:szCs w:val="19"/>
+        </w:rPr>
+        <w:t>(</w:t>
       </w:r>
       <w:proofErr w:type="spellStart"/>
       <w:r>
@@ -26880,7 +26987,15 @@
       </w:r>
       <w:proofErr w:type="spellEnd"/>
       <w:r>
-        <w:t>, dans chaque View?</w:t>
+        <w:t xml:space="preserve">, dans chaque </w:t>
+      </w:r>
+      <w:proofErr w:type="spellStart"/>
+      <w:r>
+        <w:t>View</w:t>
+      </w:r>
+      <w:proofErr w:type="spellEnd"/>
+      <w:r>
+        <w:t>?</w:t>
       </w:r>
     </w:p>
     <w:p>
@@ -31661,8 +31776,13 @@
       <w:r>
         <w:t xml:space="preserve">: FCT </w:t>
       </w:r>
-      <w:r>
-        <w:t xml:space="preserve">View Details </w:t>
+      <w:proofErr w:type="spellStart"/>
+      <w:r>
+        <w:t>View</w:t>
+      </w:r>
+      <w:proofErr w:type="spellEnd"/>
+      <w:r>
+        <w:t xml:space="preserve"> Details </w:t>
       </w:r>
       <w:proofErr w:type="spellStart"/>
       <w:r>
@@ -32053,17 +32173,8 @@
           <w:b/>
           <w:bCs/>
         </w:rPr>
-        <w:t xml:space="preserve">Manage </w:t>
-      </w:r>
-      <w:proofErr w:type="spellStart"/>
-      <w:r>
-        <w:rPr>
-          <w:b/>
-          <w:bCs/>
-        </w:rPr>
-        <w:t>Weapons</w:t>
-      </w:r>
-      <w:proofErr w:type="spellEnd"/>
+        <w:t>Manage Weapons</w:t>
+      </w:r>
     </w:p>
     <w:p>
       <w:pPr>
@@ -33128,7 +33239,6 @@
       <w:r>
         <w:t xml:space="preserve">Ajoutez la classe </w:t>
       </w:r>
-      <w:proofErr w:type="spellStart"/>
       <w:r>
         <w:rPr>
           <w:b/>
@@ -33136,7 +33246,6 @@
         </w:rPr>
         <w:t>Weapon</w:t>
       </w:r>
-      <w:proofErr w:type="spellEnd"/>
       <w:r>
         <w:t xml:space="preserve"> ci-dessous</w:t>
       </w:r>
@@ -34281,15 +34390,7 @@
         <w:t>propriétés de l</w:t>
       </w:r>
       <w:r>
-        <w:t xml:space="preserve">a classe </w:t>
-      </w:r>
-      <w:proofErr w:type="spellStart"/>
-      <w:r>
-        <w:t>Weapon</w:t>
-      </w:r>
-      <w:proofErr w:type="spellEnd"/>
-      <w:r>
-        <w:t xml:space="preserve">: </w:t>
+        <w:t xml:space="preserve">a classe Weapon: </w:t>
       </w:r>
     </w:p>
     <w:p>
@@ -34707,15 +34808,7 @@
         </w:numPr>
       </w:pPr>
       <w:r>
-        <w:t xml:space="preserve">Ajoutez une validation personnalisée à </w:t>
-      </w:r>
-      <w:proofErr w:type="spellStart"/>
-      <w:r>
-        <w:t>Weapon</w:t>
-      </w:r>
-      <w:proofErr w:type="spellEnd"/>
-      <w:r>
-        <w:t xml:space="preserve"> qui vérifie que la description est de plus de 3 mots (séparé</w:t>
+        <w:t>Ajoutez une validation personnalisée à Weapon qui vérifie que la description est de plus de 3 mots (séparé</w:t>
       </w:r>
       <w:r>
         <w:t>s</w:t>
@@ -35698,85 +35791,61 @@
       </w:r>
       <w:bookmarkStart w:id="1" w:name="_Hlk136365074"/>
       <w:r>
-        <w:t xml:space="preserve">la classe </w:t>
+        <w:t>la classe Weapon, il faut également que</w:t>
+      </w:r>
+      <w:bookmarkEnd w:id="1"/>
+      <w:r>
+        <w:t xml:space="preserve"> cette classe implémente l’interface </w:t>
       </w:r>
       <w:proofErr w:type="spellStart"/>
       <w:r>
-        <w:t>Weapon</w:t>
+        <w:rPr>
+          <w:rFonts w:ascii="Cascadia Mono" w:hAnsi="Cascadia Mono" w:cs="Cascadia Mono"/>
+          <w:color w:val="000000"/>
+          <w:sz w:val="19"/>
+          <w:szCs w:val="19"/>
+        </w:rPr>
+        <w:t>IValidatableObject</w:t>
       </w:r>
       <w:proofErr w:type="spellEnd"/>
       <w:r>
-        <w:t>, il faut également que</w:t>
-      </w:r>
-      <w:bookmarkEnd w:id="1"/>
-      <w:r>
-        <w:t xml:space="preserve"> cette classe implémente l’interface </w:t>
+        <w:rPr>
+          <w:rFonts w:ascii="Cascadia Mono" w:hAnsi="Cascadia Mono" w:cs="Cascadia Mono"/>
+          <w:color w:val="000000"/>
+          <w:sz w:val="19"/>
+          <w:szCs w:val="19"/>
+        </w:rPr>
+        <w:t xml:space="preserve"> </w:t>
+      </w:r>
+      <w:r>
+        <w:rPr>
+          <w:rFonts w:cs="Cascadia Mono"/>
+          <w:color w:val="000000"/>
+        </w:rPr>
+        <w:t xml:space="preserve">pour que </w:t>
+      </w:r>
+      <w:r>
+        <w:rPr>
+          <w:rFonts w:cs="Cascadia Mono"/>
+          <w:color w:val="000000"/>
+        </w:rPr>
+        <w:t xml:space="preserve">le </w:t>
       </w:r>
       <w:proofErr w:type="spellStart"/>
       <w:r>
         <w:rPr>
-          <w:rFonts w:ascii="Cascadia Mono" w:hAnsi="Cascadia Mono" w:cs="Cascadia Mono"/>
-          <w:color w:val="000000"/>
-          <w:sz w:val="19"/>
-          <w:szCs w:val="19"/>
-        </w:rPr>
-        <w:t>IValidatableObject</w:t>
+          <w:rFonts w:cs="Cascadia Mono"/>
+          <w:color w:val="000000"/>
+        </w:rPr>
+        <w:t>framework</w:t>
       </w:r>
       <w:proofErr w:type="spellEnd"/>
       <w:r>
         <w:rPr>
-          <w:rFonts w:ascii="Cascadia Mono" w:hAnsi="Cascadia Mono" w:cs="Cascadia Mono"/>
-          <w:color w:val="000000"/>
-          <w:sz w:val="19"/>
-          <w:szCs w:val="19"/>
-        </w:rPr>
-        <w:t xml:space="preserve"> </w:t>
-      </w:r>
-      <w:r>
-        <w:rPr>
           <w:rFonts w:cs="Cascadia Mono"/>
           <w:color w:val="000000"/>
         </w:rPr>
-        <w:t xml:space="preserve">pour que </w:t>
-      </w:r>
-      <w:r>
-        <w:rPr>
-          <w:rFonts w:cs="Cascadia Mono"/>
-          <w:color w:val="000000"/>
-        </w:rPr>
-        <w:t xml:space="preserve">le </w:t>
-      </w:r>
-      <w:proofErr w:type="spellStart"/>
-      <w:r>
-        <w:rPr>
-          <w:rFonts w:cs="Cascadia Mono"/>
-          <w:color w:val="000000"/>
-        </w:rPr>
-        <w:t>framework</w:t>
-      </w:r>
-      <w:proofErr w:type="spellEnd"/>
-      <w:r>
-        <w:rPr>
-          <w:rFonts w:cs="Cascadia Mono"/>
-          <w:color w:val="000000"/>
-        </w:rPr>
-        <w:t xml:space="preserve"> sache que </w:t>
-      </w:r>
-      <w:proofErr w:type="spellStart"/>
-      <w:r>
-        <w:rPr>
-          <w:rFonts w:cs="Cascadia Mono"/>
-          <w:color w:val="000000"/>
-        </w:rPr>
-        <w:t>Weapon</w:t>
-      </w:r>
-      <w:proofErr w:type="spellEnd"/>
-      <w:r>
-        <w:rPr>
-          <w:rFonts w:cs="Cascadia Mono"/>
-          <w:color w:val="000000"/>
-        </w:rPr>
-        <w:t xml:space="preserve"> doit être validé.</w:t>
+        <w:t xml:space="preserve"> sache que Weapon doit être validé.</w:t>
       </w:r>
     </w:p>
     <w:p>
@@ -35870,15 +35939,7 @@
         <w:t>z</w:t>
       </w:r>
       <w:r>
-        <w:t xml:space="preserve"> le contrôleur pour les </w:t>
-      </w:r>
-      <w:proofErr w:type="spellStart"/>
-      <w:r>
-        <w:t>Weapons</w:t>
-      </w:r>
-      <w:proofErr w:type="spellEnd"/>
-      <w:r>
-        <w:t xml:space="preserve"> avec les actions</w:t>
+        <w:t xml:space="preserve"> le contrôleur pour les Weapons avec les actions</w:t>
       </w:r>
       <w:r>
         <w:t xml:space="preserve"> Index et </w:t>
@@ -36712,15 +36773,7 @@
         <w:t>z</w:t>
       </w:r>
       <w:r>
-        <w:t xml:space="preserve"> les vues générées de liste et de création pour </w:t>
-      </w:r>
-      <w:proofErr w:type="spellStart"/>
-      <w:r>
-        <w:t>Weapon</w:t>
-      </w:r>
-      <w:proofErr w:type="spellEnd"/>
-      <w:r>
-        <w:t xml:space="preserve">. </w:t>
+        <w:t xml:space="preserve"> les vues générées de liste et de création pour Weapon. </w:t>
       </w:r>
     </w:p>
     <w:p>
@@ -36843,16 +36896,11 @@
         </w:numPr>
       </w:pPr>
       <w:r>
-        <w:t xml:space="preserve">Ajoutez 2 </w:t>
-      </w:r>
-      <w:proofErr w:type="spellStart"/>
-      <w:r>
-        <w:t>Weapon</w:t>
+        <w:t>Ajoutez 2 Weapon</w:t>
       </w:r>
       <w:r>
         <w:t>s</w:t>
       </w:r>
-      <w:proofErr w:type="spellEnd"/>
       <w:r>
         <w:t xml:space="preserve"> de base dans l’entrepôt de données.</w:t>
       </w:r>
@@ -38767,7 +38815,6 @@
       <w:r>
         <w:t xml:space="preserve">afficher les </w:t>
       </w:r>
-      <w:proofErr w:type="spellStart"/>
       <w:r>
         <w:rPr>
           <w:b/>
@@ -38782,7 +38829,6 @@
         </w:rPr>
         <w:t>s</w:t>
       </w:r>
-      <w:proofErr w:type="spellEnd"/>
       <w:r>
         <w:t xml:space="preserve"> et </w:t>
       </w:r>
@@ -38941,15 +38987,7 @@
         <w:t xml:space="preserve">: </w:t>
       </w:r>
       <w:r>
-        <w:t xml:space="preserve">Maintenant possible de voir la liste de </w:t>
-      </w:r>
-      <w:proofErr w:type="spellStart"/>
-      <w:r>
-        <w:t>Weapons</w:t>
-      </w:r>
-      <w:proofErr w:type="spellEnd"/>
-      <w:r>
-        <w:t xml:space="preserve"> et d’en a</w:t>
+        <w:t>Maintenant possible de voir la liste de Weapons et d’en a</w:t>
       </w:r>
       <w:r>
         <w:t>jout</w:t>
@@ -44366,7 +44404,7 @@
       <w:szCs w:val="21"/>
     </w:rPr>
   </w:style>
-  <w:style w:type="character" w:styleId="Lienhypertexte">
+  <w:style w:type="character" w:styleId="Hyperlien">
     <w:name w:val="Hyperlink"/>
     <w:basedOn w:val="Policepardfaut"/>
     <w:uiPriority w:val="99"/>
@@ -44486,7 +44524,7 @@
       </w:tblBorders>
     </w:tblPr>
   </w:style>
-  <w:style w:type="character" w:styleId="Lienhypertextesuivivisit">
+  <w:style w:type="character" w:styleId="Lienvisit">
     <w:name w:val="FollowedHyperlink"/>
     <w:basedOn w:val="Policepardfaut"/>
     <w:uiPriority w:val="99"/>
@@ -44812,15 +44850,6 @@
 </file>
 
 <file path=customXml/item1.xml><?xml version="1.0" encoding="utf-8"?>
-<?mso-contentType ?>
-<FormTemplates xmlns="http://schemas.microsoft.com/sharepoint/v3/contenttype/forms">
-  <Display>DocumentLibraryForm</Display>
-  <Edit>DocumentLibraryForm</Edit>
-  <New>DocumentLibraryForm</New>
-</FormTemplates>
-</file>
-
-<file path=customXml/item2.xml><?xml version="1.0" encoding="utf-8"?>
 <ct:contentTypeSchema xmlns:ct="http://schemas.microsoft.com/office/2006/metadata/contentType" xmlns:ma="http://schemas.microsoft.com/office/2006/metadata/properties/metaAttributes" ct:_="" ma:_="" ma:contentTypeName="Document" ma:contentTypeID="0x010100354AEAE9FD62D747A26A546E5B1B5735" ma:contentTypeVersion="7" ma:contentTypeDescription="Crée un document." ma:contentTypeScope="" ma:versionID="43b763fe9aa20b7a2976a5e019d82dbf">
   <xsd:schema xmlns:xsd="http://www.w3.org/2001/XMLSchema" xmlns:xs="http://www.w3.org/2001/XMLSchema" xmlns:p="http://schemas.microsoft.com/office/2006/metadata/properties" xmlns:ns2="071933db-0376-4694-9786-b56cb37c4ec2" targetNamespace="http://schemas.microsoft.com/office/2006/metadata/properties" ma:root="true" ma:fieldsID="d5c90ae6c1ec6ed317c9f5feddaf7a33" ns2:_="">
     <xsd:import namespace="071933db-0376-4694-9786-b56cb37c4ec2"/>
@@ -44984,25 +45013,26 @@
 </ct:contentTypeSchema>
 </file>
 
-<file path=customXml/item3.xml><?xml version="1.0" encoding="utf-8"?>
-<b:Sources xmlns:b="http://schemas.openxmlformats.org/officeDocument/2006/bibliography" xmlns="http://schemas.openxmlformats.org/officeDocument/2006/bibliography" SelectedStyle="\APASixthEditionOfficeOnline.xsl" StyleName="APA" Version="6"/>
+<file path=customXml/item2.xml><?xml version="1.0" encoding="utf-8"?>
+<?mso-contentType ?>
+<FormTemplates xmlns="http://schemas.microsoft.com/sharepoint/v3/contenttype/forms">
+  <Display>DocumentLibraryForm</Display>
+  <Edit>DocumentLibraryForm</Edit>
+  <New>DocumentLibraryForm</New>
+</FormTemplates>
 </file>
 
-<file path=customXml/item4.xml><?xml version="1.0" encoding="utf-8"?>
+<file path=customXml/item3.xml><?xml version="1.0" encoding="utf-8"?>
 <p:properties xmlns:p="http://schemas.microsoft.com/office/2006/metadata/properties" xmlns:xsi="http://www.w3.org/2001/XMLSchema-instance" xmlns:pc="http://schemas.microsoft.com/office/infopath/2007/PartnerControls">
   <documentManagement/>
 </p:properties>
 </file>
 
-<file path=customXml/itemProps1.xml><?xml version="1.0" encoding="utf-8"?>
-<ds:datastoreItem xmlns:ds="http://schemas.openxmlformats.org/officeDocument/2006/customXml" ds:itemID="{F6194C16-5FE5-4670-BEC8-3D6DD9380312}">
-  <ds:schemaRefs>
-    <ds:schemaRef ds:uri="http://schemas.microsoft.com/sharepoint/v3/contenttype/forms"/>
-  </ds:schemaRefs>
-</ds:datastoreItem>
+<file path=customXml/item4.xml><?xml version="1.0" encoding="utf-8"?>
+<b:Sources xmlns:b="http://schemas.openxmlformats.org/officeDocument/2006/bibliography" xmlns="http://schemas.openxmlformats.org/officeDocument/2006/bibliography" SelectedStyle="\APASixthEditionOfficeOnline.xsl" StyleName="APA" Version="6"/>
 </file>
 
-<file path=customXml/itemProps2.xml><?xml version="1.0" encoding="utf-8"?>
+<file path=customXml/itemProps1.xml><?xml version="1.0" encoding="utf-8"?>
 <ds:datastoreItem xmlns:ds="http://schemas.openxmlformats.org/officeDocument/2006/customXml" ds:itemID="{5C3A06EC-DC03-4D65-AA15-C6B9D68C1ED0}">
   <ds:schemaRefs>
     <ds:schemaRef ds:uri="http://schemas.microsoft.com/office/2006/metadata/contentType"/>
@@ -45020,19 +45050,27 @@
 </ds:datastoreItem>
 </file>
 
-<file path=customXml/itemProps3.xml><?xml version="1.0" encoding="utf-8"?>
-<ds:datastoreItem xmlns:ds="http://schemas.openxmlformats.org/officeDocument/2006/customXml" ds:itemID="{BA5DC8B6-1F73-4844-8DA8-B484D55D7FC3}">
+<file path=customXml/itemProps2.xml><?xml version="1.0" encoding="utf-8"?>
+<ds:datastoreItem xmlns:ds="http://schemas.openxmlformats.org/officeDocument/2006/customXml" ds:itemID="{F6194C16-5FE5-4670-BEC8-3D6DD9380312}">
   <ds:schemaRefs>
-    <ds:schemaRef ds:uri="http://schemas.openxmlformats.org/officeDocument/2006/bibliography"/>
+    <ds:schemaRef ds:uri="http://schemas.microsoft.com/sharepoint/v3/contenttype/forms"/>
   </ds:schemaRefs>
 </ds:datastoreItem>
 </file>
 
-<file path=customXml/itemProps4.xml><?xml version="1.0" encoding="utf-8"?>
+<file path=customXml/itemProps3.xml><?xml version="1.0" encoding="utf-8"?>
 <ds:datastoreItem xmlns:ds="http://schemas.openxmlformats.org/officeDocument/2006/customXml" ds:itemID="{2C36E056-BA2C-4A1F-9580-242C9B36FE70}">
   <ds:schemaRefs>
     <ds:schemaRef ds:uri="http://schemas.microsoft.com/office/2006/metadata/properties"/>
     <ds:schemaRef ds:uri="http://schemas.microsoft.com/office/infopath/2007/PartnerControls"/>
   </ds:schemaRefs>
 </ds:datastoreItem>
+</file>
+
+<file path=customXml/itemProps4.xml><?xml version="1.0" encoding="utf-8"?>
+<ds:datastoreItem xmlns:ds="http://schemas.openxmlformats.org/officeDocument/2006/customXml" ds:itemID="{BA5DC8B6-1F73-4844-8DA8-B484D55D7FC3}">
+  <ds:schemaRefs>
+    <ds:schemaRef ds:uri="http://schemas.openxmlformats.org/officeDocument/2006/bibliography"/>
+  </ds:schemaRefs>
+</ds:datastoreItem>
 </file>
</xml_diff>